<commit_message>
Tema 1: añadir apartado 6.0 (flujos) y etiquetas de sesión en el docx
- Nuevo apartado 6.0 "Dinámica de Stocks y Flujos" con la derivación
  completa de u*=s/(s+f), que faltaba en los apuntes pese a ser el
  objetivo de aprendizaje nº1 de la Sesión 2.
- Añadidas 7 etiquetas de sesión (caja salvia) en los puntos donde
  arranca cada una de las 5 sesiones de Tema 1, incluyendo el punto
  de corte dentro del epígrafe 6 (Beveridge) entre Sesión 2 (6.0-6.2)
  y Sesión 4 (6.3-6.4), reflejando el mapa de contenidos por sesión.
- Validado contra el esquema OOXML (validate.py --original): PASSED.

Co-Authored-By: Claude Sonnet 5 <noreply@anthropic.com>
Claude-Session: https://claude.ai/code/session_01Xho3ag6hb22Yfu5Qf5kBYC
</commit_message>
<xml_diff>
--- a/Temas EB - 2526/Tema 1/Apuntes/Tema 1 2627.docx
+++ b/Temas EB - 2526/Tema 1/Apuntes/Tema 1 2627.docx
@@ -25,6 +25,23 @@
       </w:pPr>
       <w:r>
         <w:t>1. FUNDAMENTOS DEL MERCADO DE TRABAJO</w:t>
+      </w:r>
+    </w:p>
+    <w:p>
+      <w:pPr>
+        <w:shd w:val="clear" w:color="auto" w:fill="76927A"/>
+        <w:spacing w:before="120" w:after="120"/>
+        <w:jc w:val="left"/>
+      </w:pPr>
+      <w:r>
+        <w:rPr>
+          <w:b/>
+          <w:bCs/>
+          <w:color w:val="FFFFFF"/>
+          <w:sz w:val="20"/>
+          <w:szCs w:val="20"/>
+        </w:rPr>
+        <w:t xml:space="preserve">📍 SESIÓN 1 · Semana 1 (Lunes 14/09, últimos 30 min de la sesión, tras Tema 0) — Arranque de Tema 1, sin dinámica de innovación todavía</w:t>
       </w:r>
     </w:p>
     <w:p>
@@ -1704,6 +1721,23 @@
       </w:pPr>
       <w:r>
         <w:t>2. EL PIB Y LA PRODUCTIVIDAD EN EL MERCADO LABORAL</w:t>
+      </w:r>
+    </w:p>
+    <w:p>
+      <w:pPr>
+        <w:shd w:val="clear" w:color="auto" w:fill="76927A"/>
+        <w:spacing w:before="120" w:after="120"/>
+        <w:jc w:val="left"/>
+      </w:pPr>
+      <w:r>
+        <w:rPr>
+          <w:b/>
+          <w:bCs/>
+          <w:color w:val="FFFFFF"/>
+          <w:sz w:val="20"/>
+          <w:szCs w:val="20"/>
+        </w:rPr>
+        <w:t xml:space="preserve">📍 SESIÓN 5 · Semana 3 (primera sesión de la semana: Martes 29/09 en L1 · Lunes 28/09 en L2) — Cierre de Tema 1, junto con el epígrafe 5</w:t>
       </w:r>
     </w:p>
     <w:p/>
@@ -3663,6 +3697,23 @@
         <w:t>EQUILIBRIO EN EL MERCADO DE TRABAJO</w:t>
       </w:r>
     </w:p>
+    <w:p>
+      <w:pPr>
+        <w:shd w:val="clear" w:color="auto" w:fill="76927A"/>
+        <w:spacing w:before="120" w:after="120"/>
+        <w:jc w:val="left"/>
+      </w:pPr>
+      <w:r>
+        <w:rPr>
+          <w:b/>
+          <w:bCs/>
+          <w:color w:val="FFFFFF"/>
+          <w:sz w:val="20"/>
+          <w:szCs w:val="20"/>
+        </w:rPr>
+        <w:t xml:space="preserve">📍 SESIÓN 3 · Semana 2 (Lunes 21/09, 90 min)</w:t>
+      </w:r>
+    </w:p>
     <w:p/>
     <w:p>
       <w:pPr>
@@ -4947,6 +4998,23 @@
     </w:p>
     <w:p>
       <w:pPr>
+        <w:shd w:val="clear" w:color="auto" w:fill="76927A"/>
+        <w:spacing w:before="120" w:after="120"/>
+        <w:jc w:val="left"/>
+      </w:pPr>
+      <w:r>
+        <w:rPr>
+          <w:b/>
+          <w:bCs/>
+          <w:color w:val="FFFFFF"/>
+          <w:sz w:val="20"/>
+          <w:szCs w:val="20"/>
+        </w:rPr>
+        <w:t xml:space="preserve">📍 SESIÓN 2 · Semana 1 (Martes 15/09 · Viernes 18/09, 120 min) — primer bloque de la sesión</w:t>
+      </w:r>
+    </w:p>
+    <w:p>
+      <w:pPr>
         <w:jc w:val="both"/>
       </w:pPr>
     </w:p>
@@ -7018,6 +7086,23 @@
       </w:pPr>
       <w:r>
         <w:t>5. LA TASA NATURAL DE DESEMPLEO Y LA CURVA DE PHILLIPS</w:t>
+      </w:r>
+    </w:p>
+    <w:p>
+      <w:pPr>
+        <w:shd w:val="clear" w:color="auto" w:fill="76927A"/>
+        <w:spacing w:before="120" w:after="120"/>
+        <w:jc w:val="left"/>
+      </w:pPr>
+      <w:r>
+        <w:rPr>
+          <w:b/>
+          <w:bCs/>
+          <w:color w:val="FFFFFF"/>
+          <w:sz w:val="20"/>
+          <w:szCs w:val="20"/>
+        </w:rPr>
+        <w:t xml:space="preserve">📍 SESIÓN 5 · Semana 3 — segundo bloque de la sesión, junto con el epígrafe 2</w:t>
       </w:r>
     </w:p>
     <w:p>
@@ -8472,6 +8557,182 @@
     </w:p>
     <w:p>
       <w:pPr>
+        <w:shd w:val="clear" w:color="auto" w:fill="76927A"/>
+        <w:spacing w:before="120" w:after="120"/>
+        <w:jc w:val="left"/>
+      </w:pPr>
+      <w:r>
+        <w:rPr>
+          <w:b/>
+          <w:bCs/>
+          <w:color w:val="FFFFFF"/>
+          <w:sz w:val="20"/>
+          <w:szCs w:val="20"/>
+        </w:rPr>
+        <w:t xml:space="preserve">📍 SESIÓN 2 (continuación) · apartados 6.0 a 6.2 — dinámica de flujos y lectura gráfica de la curva</w:t>
+      </w:r>
+    </w:p>
+    <w:p>
+      <w:pPr>
+        <w:jc w:val="both"/>
+        <w:rPr>
+          <w:b/>
+          <w:bCs/>
+        </w:rPr>
+      </w:pPr>
+      <w:r>
+        <w:rPr>
+          <w:b/>
+          <w:bCs/>
+        </w:rPr>
+        <w:t xml:space="preserve">6.0. Dinámica de Stocks y Flujos: la Ecuación de Equilibrio del Desempleo</w:t>
+      </w:r>
+    </w:p>
+    <w:p>
+      <w:pPr>
+        <w:jc w:val="both"/>
+      </w:pPr>
+      <w:r>
+        <w:t xml:space="preserve">Antes de analizar la Curva de Beveridge como relación estática entre vacantes y desempleo, conviene entender el mercado de trabajo como un sistema dinámico de flujos. En cada periodo, el stock de desempleados (U) no es fijo: recibe entradas desde el empleo (destrucción de puestos de trabajo) y genera salidas hacia el empleo (contrataciones). Esta perspectiva de flujos sustenta tanto el concepto de tasa natural de desempleo como la propia función de emparejamiento que se presenta a continuación.</w:t>
+      </w:r>
+    </w:p>
+    <w:p>
+      <w:pPr>
+        <w:jc w:val="both"/>
+      </w:pPr>
+      <w:r>
+        <w:rPr>
+          <w:b/>
+          <w:bCs/>
+        </w:rPr>
+        <w:t xml:space="preserve">Tasa de separación (s): </w:t>
+      </w:r>
+      <w:r>
+        <w:t xml:space="preserve">probabilidad de que un ocupado pierda su empleo y pase a desempleado en un periodo dado.</w:t>
+      </w:r>
+    </w:p>
+    <w:p>
+      <w:pPr>
+        <w:jc w:val="both"/>
+      </w:pPr>
+      <w:r>
+        <w:rPr>
+          <w:b/>
+          <w:bCs/>
+        </w:rPr>
+        <w:t xml:space="preserve">Tasa de salida del desempleo (f): </w:t>
+      </w:r>
+      <w:r>
+        <w:t xml:space="preserve">probabilidad de que un desempleado encuentre trabajo y pase a ocupado en un periodo dado.</w:t>
+      </w:r>
+    </w:p>
+    <w:p>
+      <w:pPr>
+        <w:jc w:val="both"/>
+      </w:pPr>
+      <w:r>
+        <w:t xml:space="preserve">El desempleo se encuentra en equilibrio dinámico (estado estacionario) cuando el flujo de entrada al desempleo iguala al flujo de salida:</w:t>
+      </w:r>
+    </w:p>
+    <w:p>
+      <w:pPr>
+        <w:jc w:val="both"/>
+      </w:pPr>
+      <m:oMathPara>
+        <m:oMath>
+          <m:r>
+            <w:rPr>
+              <w:rFonts w:ascii="Cambria Math" w:hAnsi="Cambria Math"/>
+            </w:rPr>
+            <m:t>∆U=s·E-f·U=0</m:t>
+          </m:r>
+        </m:oMath>
+      </m:oMathPara>
+    </w:p>
+    <w:p>
+      <w:pPr>
+        <w:jc w:val="both"/>
+      </w:pPr>
+      <w:r>
+        <w:t xml:space="preserve">Despejando esta condición de equilibrio se obtiene la tasa de desempleo de equilibrio:</w:t>
+      </w:r>
+    </w:p>
+    <w:p>
+      <w:pPr>
+        <w:jc w:val="both"/>
+      </w:pPr>
+      <m:oMathPara>
+        <m:oMath>
+          <m:r>
+            <w:rPr>
+              <w:rFonts w:ascii="Cambria Math" w:hAnsi="Cambria Math"/>
+            </w:rPr>
+            <m:t>u*=</m:t>
+          </m:r>
+          <m:f>
+            <m:fPr>
+              <m:ctrlPr>
+                <w:rPr>
+                  <w:rFonts w:ascii="Cambria Math" w:hAnsi="Cambria Math"/>
+                  <w:i/>
+                </w:rPr>
+              </m:ctrlPr>
+            </m:fPr>
+            <m:num>
+              <m:r>
+                <w:rPr>
+                  <w:rFonts w:ascii="Cambria Math" w:hAnsi="Cambria Math"/>
+                </w:rPr>
+                <m:t>s</m:t>
+              </m:r>
+            </m:num>
+            <m:den>
+              <m:r>
+                <w:rPr>
+                  <w:rFonts w:ascii="Cambria Math" w:hAnsi="Cambria Math"/>
+                </w:rPr>
+                <m:t>s+f</m:t>
+              </m:r>
+            </m:den>
+          </m:f>
+        </m:oMath>
+      </m:oMathPara>
+    </w:p>
+    <w:p>
+      <w:pPr>
+        <w:jc w:val="both"/>
+      </w:pPr>
+      <w:r>
+        <w:rPr>
+          <w:b/>
+          <w:bCs/>
+        </w:rPr>
+        <w:t xml:space="preserve">Implicación para el diseño de políticas sociolaborales: </w:t>
+      </w:r>
+      <w:r>
+        <w:t xml:space="preserve">existen dos únicas palancas para reducir el desempleo de equilibrio: actuar sobre </w:t>
+      </w:r>
+      <w:r>
+        <w:rPr>
+          <w:i/>
+        </w:rPr>
+        <w:t xml:space="preserve">s</w:t>
+      </w:r>
+      <w:r>
+        <w:t xml:space="preserve"> (reduciendo la rotación injustificada y la temporalidad excesiva) o actuar sobre </w:t>
+      </w:r>
+      <w:r>
+        <w:rPr>
+          <w:i/>
+        </w:rPr>
+        <w:t xml:space="preserve">f</w:t>
+      </w:r>
+      <w:r>
+        <w:t xml:space="preserve"> (mejorando la intermediación laboral, la formación y la eficacia de los servicios públicos de empleo). Esta doble palanca conecta directamente con la función de emparejamiento y la Curva de Beveridge que se desarrollan a continuación.</w:t>
+      </w:r>
+    </w:p>
+    <w:p>
+      <w:pPr>
         <w:jc w:val="both"/>
         <w:rPr>
           <w:b/>
@@ -9088,6 +9349,23 @@
       </w:r>
       <w:r>
         <w:t>: Indica una mejora en la eficiencia del mercado laboral</w:t>
+      </w:r>
+    </w:p>
+    <w:p>
+      <w:pPr>
+        <w:shd w:val="clear" w:color="auto" w:fill="76927A"/>
+        <w:spacing w:before="120" w:after="120"/>
+        <w:jc w:val="left"/>
+      </w:pPr>
+      <w:r>
+        <w:rPr>
+          <w:b/>
+          <w:bCs/>
+          <w:color w:val="FFFFFF"/>
+          <w:sz w:val="20"/>
+          <w:szCs w:val="20"/>
+        </w:rPr>
+        <w:t xml:space="preserve">📍 SESIÓN 4 · Semana 2 (Martes 22/09 · Viernes 25/09, 120 min) — apartados 6.3-6.4 y conexión con el Caso 1 de EPD</w:t>
       </w:r>
     </w:p>
     <w:p>

</xml_diff>

<commit_message>
Tema 1: reordenar etiquetas de sesión en secuencia lineal (S1→S5)
Las 5 etiquetas de sesión aparecían en orden no correlativo al leer el
docx de corrido (S1,S5,S3,S2,S5,S2,S4), porque las sesiones no seguían
el orden temático del documento. Se reasignan sin mover ningún párrafo
(el orden temático ya era lineal): S1=Fundamentos, S2=PIB/Productividad,
S3=Equilibrio (sin cambios), S4=Tipología+NAIRU juntos, S5=Beveridge
completo (epígrafe 6 entero, como cierre/síntesis de Tema 1, sin
partirlo en dos sesiones).

Actualiza el mapa de contenidos con el nuevo reparto y añade la
Alerta 8: los guiones de las Sesiones 2 y 4 quedaron desalineados con
este nuevo reparto y necesitan reescritura; la Sesión 5 no tiene guion.

Co-Authored-By: Claude Sonnet 5 <noreply@anthropic.com>
Claude-Session: https://claude.ai/code/session_01Xho3ag6hb22Yfu5Qf5kBYC
</commit_message>
<xml_diff>
--- a/Temas EB - 2526/Tema 1/Apuntes/Tema 1 2627.docx
+++ b/Temas EB - 2526/Tema 1/Apuntes/Tema 1 2627.docx
@@ -1737,7 +1737,7 @@
           <w:sz w:val="20"/>
           <w:szCs w:val="20"/>
         </w:rPr>
-        <w:t xml:space="preserve">📍 SESIÓN 5 · Semana 3 (primera sesión de la semana: Martes 29/09 en L1 · Lunes 28/09 en L2) — Cierre de Tema 1, junto con el epígrafe 5</w:t>
+        <w:t xml:space="preserve">📍 SESIÓN 2 · Semana 1 (Martes 15/09 · Viernes 18/09, 120 min)</w:t>
       </w:r>
     </w:p>
     <w:p/>
@@ -5010,7 +5010,7 @@
           <w:sz w:val="20"/>
           <w:szCs w:val="20"/>
         </w:rPr>
-        <w:t xml:space="preserve">📍 SESIÓN 2 · Semana 1 (Martes 15/09 · Viernes 18/09, 120 min) — primer bloque de la sesión</w:t>
+        <w:t xml:space="preserve">📍 SESIÓN 4 · Semana 2 (Martes 22/09 · Viernes 25/09, 120 min)</w:t>
       </w:r>
     </w:p>
     <w:p>
@@ -7102,7 +7102,7 @@
           <w:sz w:val="20"/>
           <w:szCs w:val="20"/>
         </w:rPr>
-        <w:t xml:space="preserve">📍 SESIÓN 5 · Semana 3 — segundo bloque de la sesión, junto con el epígrafe 2</w:t>
+        <w:t xml:space="preserve">📍 SESIÓN 4 (continuación) · mismo bloque de 120 min</w:t>
       </w:r>
     </w:p>
     <w:p>
@@ -8569,7 +8569,7 @@
           <w:sz w:val="20"/>
           <w:szCs w:val="20"/>
         </w:rPr>
-        <w:t xml:space="preserve">📍 SESIÓN 2 (continuación) · apartados 6.0 a 6.2 — dinámica de flujos y lectura gráfica de la curva</w:t>
+        <w:t xml:space="preserve">📍 SESIÓN 5 · Semana 3 (primera sesión: Martes 29/09 en L1, 2h · Lunes 28/09 en L2, 1,5h) — Beveridge completo, cierre y síntesis de Tema 1</w:t>
       </w:r>
     </w:p>
     <w:p>
@@ -9349,23 +9349,6 @@
       </w:r>
       <w:r>
         <w:t>: Indica una mejora en la eficiencia del mercado laboral</w:t>
-      </w:r>
-    </w:p>
-    <w:p>
-      <w:pPr>
-        <w:shd w:val="clear" w:color="auto" w:fill="76927A"/>
-        <w:spacing w:before="120" w:after="120"/>
-        <w:jc w:val="left"/>
-      </w:pPr>
-      <w:r>
-        <w:rPr>
-          <w:b/>
-          <w:bCs/>
-          <w:color w:val="FFFFFF"/>
-          <w:sz w:val="20"/>
-          <w:szCs w:val="20"/>
-        </w:rPr>
-        <w:t xml:space="preserve">📍 SESIÓN 4 · Semana 2 (Martes 22/09 · Viernes 25/09, 120 min) — apartados 6.3-6.4 y conexión con el Caso 1 de EPD</w:t>
       </w:r>
     </w:p>
     <w:p>

</xml_diff>